<commit_message>
Tweaked a few things
</commit_message>
<xml_diff>
--- a/report/Stage 2 - First Progress Report/Stage 2 - First Progress Report.docx
+++ b/report/Stage 2 - First Progress Report/Stage 2 - First Progress Report.docx
@@ -551,6 +551,49 @@
     <w:p>
       <w:pPr>
         <w:pStyle w:val="Title"/>
+      </w:pPr>
+      <w:r>
+        <w:lastRenderedPageBreak/>
+        <w:t>Abstract</w:t>
+      </w:r>
+    </w:p>
+    <w:p>
+      <w:r>
+        <w:t xml:space="preserve">This project proposes the design and implementation of a custom 16-bit RISC system on chip on the </w:t>
+      </w:r>
+      <w:proofErr w:type="spellStart"/>
+      <w:r>
+        <w:t>Nexys</w:t>
+      </w:r>
+      <w:proofErr w:type="spellEnd"/>
+      <w:r>
+        <w:t xml:space="preserve"> A7 100-T Board. The system will include a simple processor core, instruction ROM, data RAM and memory-mapped peripherals for switches, push buttons, LEDs, seven segment displays, and VGA output. The processor will execute a digital lock application in which a user enters a code through board inputs, and the system responds by displaying lock status messages such as locked, access granted, access denied, and lockout. The purpose of this project is to demonstrate processor design, memory interfacing, peripheral control, and hardware/software interaction in a visible and interactive embedded environment. The completed design will be verified through simulation of individual modules and demonstrated on the </w:t>
+      </w:r>
+      <w:proofErr w:type="spellStart"/>
+      <w:r>
+        <w:t>Nexys</w:t>
+      </w:r>
+      <w:proofErr w:type="spellEnd"/>
+      <w:r>
+        <w:t xml:space="preserve"> A7 board with real time visual output.</w:t>
+      </w:r>
+    </w:p>
+    <w:p>
+      <w:pPr>
+        <w:rPr>
+          <w:noProof/>
+        </w:rPr>
+      </w:pPr>
+      <w:r>
+        <w:rPr>
+          <w:noProof/>
+        </w:rPr>
+        <w:br w:type="page"/>
+      </w:r>
+    </w:p>
+    <w:p>
+      <w:pPr>
+        <w:pStyle w:val="Title"/>
         <w:tabs>
           <w:tab w:val="left" w:pos="629"/>
           <w:tab w:val="center" w:pos="4680"/>
@@ -568,7 +611,39 @@
     </w:p>
     <w:p>
       <w:r>
-        <w:t>This project implements a custom 16-bit RISC processor on the Nexys A7-100T FPGA board to control a digital lock system with VGA status output. The system demonstrates processor design, memory-mapped input/output, embedded control, and hardware verification. The processor executes a program stored in ROM to read user inputs, compare a passcode, update lock state, and drive peripheral outputs including LEDs, seven segment display, and VGA.</w:t>
+        <w:t xml:space="preserve">This project implements a custom 16-bit RISC processor on the </w:t>
+      </w:r>
+      <w:proofErr w:type="spellStart"/>
+      <w:r>
+        <w:t>Nexys</w:t>
+      </w:r>
+      <w:proofErr w:type="spellEnd"/>
+      <w:r>
+        <w:t xml:space="preserve"> A7-100T FPGA board to control a digital lock system with VGA status output. The system demonstrates processor design, memory-mapped input/output, embedded control, and hardware verification. The processor executes a program stored in ROM to read user inputs, </w:t>
+      </w:r>
+      <w:proofErr w:type="gramStart"/>
+      <w:r>
+        <w:t>compare</w:t>
+      </w:r>
+      <w:proofErr w:type="gramEnd"/>
+      <w:r>
+        <w:t xml:space="preserve"> </w:t>
+      </w:r>
+      <w:proofErr w:type="gramStart"/>
+      <w:r>
+        <w:t>a passcode</w:t>
+      </w:r>
+      <w:proofErr w:type="gramEnd"/>
+      <w:r>
+        <w:t xml:space="preserve">, update lock state, and </w:t>
+      </w:r>
+      <w:proofErr w:type="gramStart"/>
+      <w:r>
+        <w:t>drive</w:t>
+      </w:r>
+      <w:proofErr w:type="gramEnd"/>
+      <w:r>
+        <w:t xml:space="preserve"> peripheral outputs including LEDs, seven segment display, and VGA.</w:t>
       </w:r>
     </w:p>
     <w:p>
@@ -632,8 +707,13 @@
           <w:numId w:val="11"/>
         </w:numPr>
       </w:pPr>
-      <w:r>
-        <w:t>Nexys A7 100T board peripherals</w:t>
+      <w:proofErr w:type="spellStart"/>
+      <w:r>
+        <w:t>Nexys</w:t>
+      </w:r>
+      <w:proofErr w:type="spellEnd"/>
+      <w:r>
+        <w:t xml:space="preserve"> A7 100T board peripherals</w:t>
       </w:r>
     </w:p>
     <w:p>
@@ -736,8 +816,13 @@
           <w:numId w:val="13"/>
         </w:numPr>
       </w:pPr>
-      <w:r>
-        <w:t>Nexys A7 Board documentation</w:t>
+      <w:proofErr w:type="spellStart"/>
+      <w:r>
+        <w:t>Nexys</w:t>
+      </w:r>
+      <w:proofErr w:type="spellEnd"/>
+      <w:r>
+        <w:t xml:space="preserve"> A7 Board documentation</w:t>
       </w:r>
     </w:p>
     <w:p>
@@ -749,7 +834,15 @@
         </w:numPr>
       </w:pPr>
       <w:r>
-        <w:t>Verilog/Vivado tutorials for ROM, RAM, and block design</w:t>
+        <w:t>Verilog/</w:t>
+      </w:r>
+      <w:proofErr w:type="spellStart"/>
+      <w:r>
+        <w:t>Vivado</w:t>
+      </w:r>
+      <w:proofErr w:type="spellEnd"/>
+      <w:r>
+        <w:t xml:space="preserve"> tutorials for ROM, RAM, and block design</w:t>
       </w:r>
     </w:p>
     <w:p>
@@ -773,7 +866,15 @@
         </w:numPr>
       </w:pPr>
       <w:r>
-        <w:t>CPU arhictecture references</w:t>
+        <w:t xml:space="preserve">CPU </w:t>
+      </w:r>
+      <w:proofErr w:type="spellStart"/>
+      <w:r>
+        <w:t>arhictecture</w:t>
+      </w:r>
+      <w:proofErr w:type="spellEnd"/>
+      <w:r>
+        <w:t xml:space="preserve"> references</w:t>
       </w:r>
     </w:p>
     <w:p>
@@ -905,7 +1006,23 @@
     </w:p>
     <w:p>
       <w:r>
-        <w:t xml:space="preserve">The main obstacles have to do with starting off the design. Where to even start, and through trial and error of keeping everything simple. Whether if this has to do with having a simple CPU design, or handling I/O peripherals. </w:t>
+        <w:t xml:space="preserve">The main obstacles have to do with starting off the design. Where to even start, and through trial and error of keeping everything simple. </w:t>
+      </w:r>
+      <w:proofErr w:type="gramStart"/>
+      <w:r>
+        <w:t>Whether if</w:t>
+      </w:r>
+      <w:proofErr w:type="gramEnd"/>
+      <w:r>
+        <w:t xml:space="preserve"> this has to do with having a simple CPU </w:t>
+      </w:r>
+      <w:proofErr w:type="gramStart"/>
+      <w:r>
+        <w:t>design, or</w:t>
+      </w:r>
+      <w:proofErr w:type="gramEnd"/>
+      <w:r>
+        <w:t xml:space="preserve"> handling I/O peripherals. </w:t>
       </w:r>
     </w:p>
     <w:p>
@@ -1099,8 +1216,13 @@
           </w:tcPr>
           <w:p>
             <w:r>
-              <w:t>Input/Output, LED, switches, seven segment</w:t>
-            </w:r>
+              <w:t xml:space="preserve">Input/Output, LED, switches, seven </w:t>
+            </w:r>
+            <w:proofErr w:type="gramStart"/>
+            <w:r>
+              <w:t>segment</w:t>
+            </w:r>
+            <w:proofErr w:type="gramEnd"/>
           </w:p>
         </w:tc>
         <w:tc>

</xml_diff>